<commit_message>
Validate and document week 1 labs
</commit_message>
<xml_diff>
--- a/Week_01/Day_02/Lab/Day_02_Lab_Guide.docx
+++ b/Week_01/Day_02/Lab/Day_02_Lab_Guide.docx
@@ -1,6 +1,6 @@
 
 <file path=word/document.xml><?xml version="1.0" encoding="utf-8"?>
-<w:document xmlns:wpc="http://schemas.microsoft.com/office/word/2010/wordprocessingCanvas" xmlns:mo="http://schemas.microsoft.com/office/mac/office/2008/main" xmlns:mc="http://schemas.openxmlformats.org/markup-compatibility/2006" xmlns:mv="urn:schemas-microsoft-com:mac:vml" xmlns:o="urn:schemas-microsoft-com:office:office" xmlns:r="http://schemas.openxmlformats.org/officeDocument/2006/relationships" xmlns:m="http://schemas.openxmlformats.org/officeDocument/2006/math" xmlns:v="urn:schemas-microsoft-com:vml" xmlns:wp14="http://schemas.microsoft.com/office/word/2010/wordprocessingDrawing" xmlns:wp="http://schemas.openxmlformats.org/drawingml/2006/wordprocessingDrawing" xmlns:w10="urn:schemas-microsoft-com:office:word" xmlns:w="http://schemas.openxmlformats.org/wordprocessingml/2006/main" xmlns:w14="http://schemas.microsoft.com/office/word/2010/wordml" xmlns:wpg="http://schemas.microsoft.com/office/word/2010/wordprocessingGroup" xmlns:wpi="http://schemas.microsoft.com/office/word/2010/wordprocessingInk" xmlns:wne="http://schemas.microsoft.com/office/word/2006/wordml" xmlns:wps="http://schemas.microsoft.com/office/word/2010/wordprocessingShape" mc:Ignorable="w14 wp14">
+<w:document xmlns:ns1="http://schemas.openxmlformats.org/markup-compatibility/2006" xmlns:w="http://schemas.openxmlformats.org/wordprocessingml/2006/main" ns1:Ignorable="w14 wp14">
   <w:body>
     <w:p>
       <w:pPr>
@@ -142,9 +142,19 @@
       </w:r>
     </w:p>
     <w:p>
+      <w:r>
+        <w:t>Correction for the supplied KRaft Compose file: the Kafka service must include a CLUSTER_ID environment value, for example CLUSTER_ID: 'MkU3OEVBNTcwNTJENDM2Qk'.</w:t>
+      </w:r>
+    </w:p>
+    <w:p>
       <w:pPr>
         <w:pStyle w:val="BodyText"/>
       </w:pPr>
+    </w:p>
+    <w:p>
+      <w:r>
+        <w:t>If you run Docker through sudo and the mounted ./data folder becomes root-owned, make it writable for the Kafka container before starting: sudo mkdir -p data &amp;&amp; sudo chown -R 1000:1000 data</w:t>
+      </w:r>
     </w:p>
     <w:p>
       <w:pPr>
@@ -181,11 +191,8 @@
       </w:r>
     </w:p>
     <w:p>
-      <w:pPr>
-        <w:pStyle w:val="BodyText"/>
-      </w:pPr>
       <w:r>
-        <w:t># Use the kafka-topics.sh script inside the container</w:t>
+        <w:t># Use the Kafka topic command inside the container. In the supplied Confluent image, the commands do not use the .sh suffix.</w:t>
       </w:r>
     </w:p>
     <w:p>
@@ -202,11 +209,8 @@
       </w:pPr>
     </w:p>
     <w:p>
-      <w:pPr>
-        <w:pStyle w:val="BodyText"/>
-      </w:pPr>
       <w:r>
-        <w:t>docker exec -it &lt;container_id&gt; kafka-topics.sh --create --topic demo-topic --partitions 3 --replication-factor 1 --bootstrap-server localhost:9092</w:t>
+        <w:t>docker exec -it &lt;container_id&gt; kafka-topics --create --topic demo-topic --partitions 3 --replication-factor 1 --bootstrap-server localhost:9092</w:t>
       </w:r>
     </w:p>
     <w:p>
@@ -228,11 +232,8 @@
       </w:pPr>
     </w:p>
     <w:p>
-      <w:pPr>
-        <w:pStyle w:val="BodyText"/>
-      </w:pPr>
       <w:r>
-        <w:t>docker exec -it &lt;container_id&gt; kafka-topics.sh --describe --topic demo-topic --bootstrap-server localhost:9092</w:t>
+        <w:t>docker exec -it &lt;container_id&gt; kafka-topics --describe --topic demo-topic --bootstrap-server localhost:9092</w:t>
       </w:r>
     </w:p>
     <w:p>
@@ -262,11 +263,8 @@
       </w:r>
     </w:p>
     <w:p>
-      <w:pPr>
-        <w:pStyle w:val="BodyText"/>
-      </w:pPr>
       <w:r>
-        <w:t>docker exec -it &lt;container_id&gt; kafka-console-producer.sh --topic demo-topic --bootstrap-server localhost:9092 --property parse.key=true --property key.separator=:</w:t>
+        <w:t>docker exec -it &lt;container_id&gt; kafka-console-producer --topic demo-topic --bootstrap-server localhost:9092 --property parse.key=true --property key.separator=:</w:t>
       </w:r>
     </w:p>
     <w:p>
@@ -333,11 +331,8 @@
       </w:r>
     </w:p>
     <w:p>
-      <w:pPr>
-        <w:pStyle w:val="BodyText"/>
-      </w:pPr>
       <w:r>
-        <w:t>docker exec -it &lt;container_id&gt; kafka-console-consumer.sh --topic demo-topic --from-beginning --bootstrap-server localhost:9092 --group group1</w:t>
+        <w:t>docker exec -it &lt;container_id&gt; kafka-console-consumer --topic demo-topic --from-beginning --bootstrap-server localhost:9092 --group group1</w:t>
       </w:r>
     </w:p>
     <w:p>
@@ -354,11 +349,8 @@
       </w:r>
     </w:p>
     <w:p>
-      <w:pPr>
-        <w:pStyle w:val="BodyText"/>
-      </w:pPr>
       <w:r>
-        <w:t>docker exec -it &lt;container_id&gt; kafka-console-consumer.sh --topic demo-topic --from-beginning --bootstrap-server localhost:9092 --group group1</w:t>
+        <w:t>docker exec -it &lt;container_id&gt; kafka-console-consumer --topic demo-topic --from-beginning --bootstrap-server localhost:9092 --group group1</w:t>
       </w:r>
     </w:p>
     <w:p>
@@ -375,11 +367,8 @@
       </w:r>
     </w:p>
     <w:p>
-      <w:pPr>
-        <w:pStyle w:val="BodyText"/>
-      </w:pPr>
       <w:r>
-        <w:t>docker exec -it &lt;container_id&gt; kafka-console-consumer.sh --topic demo-topic --from-beginning --bootstrap-server localhost:9092 --group group2</w:t>
+        <w:t>docker exec -it &lt;container_id&gt; kafka-console-consumer --topic demo-topic --from-beginning --bootstrap-server localhost:9092 --group group2</w:t>
       </w:r>
     </w:p>
     <w:p>
@@ -401,11 +390,8 @@
       </w:r>
     </w:p>
     <w:p>
-      <w:pPr>
-        <w:pStyle w:val="BodyText"/>
-      </w:pPr>
       <w:r>
-        <w:t>pip install kafka-python</w:t>
+        <w:t>python3 -m pip install --user kafka-python</w:t>
       </w:r>
     </w:p>
     <w:p>

</xml_diff>

<commit_message>
Improve Kafka lab: add install scripts & clients
Add platform install scripts and modernize Day 2 Kafka lab. Introduces install_linux.sh and install_windows.ps1 to provision Docker, Python and tooling. Update producer.py and consumer.py to use a structured "order-events" topic, JSON (de)serializers, explicit client/group IDs, better producer tuning (compression, retries, larger batch) and delivery reporting, and a consumer timeout for graceful stop. Modify docker-compose.yml to configure separate internal/host listeners, advertise the host listener on 9092/29092 and add a kafka-ui service for cluster inspection. Also update binary lab guide and slides.
</commit_message>
<xml_diff>
--- a/Week_01/Day_02/Lab/Day_02_Lab_Guide.docx
+++ b/Week_01/Day_02/Lab/Day_02_Lab_Guide.docx
@@ -1,22 +1,24 @@
 
 <file path=word/document.xml><?xml version="1.0" encoding="utf-8"?>
-<w:document xmlns:ns1="http://schemas.openxmlformats.org/markup-compatibility/2006" xmlns:w="http://schemas.openxmlformats.org/wordprocessingml/2006/main" ns1:Ignorable="w14 wp14">
+<w:document xmlns:wpc="http://schemas.microsoft.com/office/word/2010/wordprocessingCanvas" xmlns:mo="http://schemas.microsoft.com/office/mac/office/2008/main" xmlns:mc="http://schemas.openxmlformats.org/markup-compatibility/2006" xmlns:mv="urn:schemas-microsoft-com:mac:vml" xmlns:o="urn:schemas-microsoft-com:office:office" xmlns:r="http://schemas.openxmlformats.org/officeDocument/2006/relationships" xmlns:m="http://schemas.openxmlformats.org/officeDocument/2006/math" xmlns:v="urn:schemas-microsoft-com:vml" xmlns:wp14="http://schemas.microsoft.com/office/word/2010/wordprocessingDrawing" xmlns:wp="http://schemas.openxmlformats.org/drawingml/2006/wordprocessingDrawing" xmlns:w10="urn:schemas-microsoft-com:office:word" xmlns:w="http://schemas.openxmlformats.org/wordprocessingml/2006/main" xmlns:w14="http://schemas.microsoft.com/office/word/2010/wordml" xmlns:wpg="http://schemas.microsoft.com/office/word/2010/wordprocessingGroup" xmlns:wpi="http://schemas.microsoft.com/office/word/2010/wordprocessingInk" xmlns:wne="http://schemas.microsoft.com/office/word/2006/wordml" xmlns:wps="http://schemas.microsoft.com/office/word/2010/wordprocessingShape" mc:Ignorable="w14 wp14">
   <w:body>
     <w:p>
-      <w:pPr>
-        <w:pStyle w:val="Title"/>
-        <w:jc w:val="center"/>
-      </w:pPr>
       <w:r>
-        <w:t>Day 2 Lab Manual: Apache Kafka Fundamentals</w:t>
+        <w:rPr>
+          <w:b/>
+          <w:sz w:val="44"/>
+        </w:rPr>
+        <w:t>Day 2 Lab Guide: Apache Kafka Fundamentals</w:t>
       </w:r>
     </w:p>
     <w:p>
-      <w:pPr>
-        <w:jc w:val="center"/>
-      </w:pPr>
       <w:r>
-        <w:t>Building Kafka Topics, Producers, Consumers and Exploring Serialization</w:t>
+        <w:t>Event bus architecture, Kafka UI, topics, partitions, producer flags, consumer flags, and Python producer/consumer code.</w:t>
+      </w:r>
+    </w:p>
+    <w:p>
+      <w:r>
+        <w:t>Each exercise explains what the command does, what to observe, and why it matters.</w:t>
       </w:r>
     </w:p>
     <w:p>
@@ -24,7 +26,7 @@
         <w:pStyle w:val="Heading1"/>
       </w:pPr>
       <w:r>
-        <w:t>1  Introduction</w:t>
+        <w:t>Exercise 1: Verify the Lab Machine</w:t>
       </w:r>
     </w:p>
     <w:p>
@@ -32,10 +34,198 @@
         <w:rPr>
           <w:b/>
         </w:rPr>
-        <w:t xml:space="preserve">Welcome to the Day 2 lab session. </w:t>
+        <w:t xml:space="preserve">Goal: </w:t>
       </w:r>
       <w:r>
-        <w:t>In this lab you will deepen your understanding of Apache Kafka by performing hands-on exercises. You will spin up a Kafka cluster using Docker Compose, create topics, produce and consume messages from the command line and from Python, experiment with partitioning and consumer groups, and think about how serialization frameworks like Avro enable schema evolution. These exercises complement the lecture material and will help you gain confidence designing event streaming applications.</w:t>
+        <w:t>Confirm Docker, Docker Compose and Python are available.</w:t>
+      </w:r>
+    </w:p>
+    <w:p>
+      <w:r>
+        <w:rPr>
+          <w:b/>
+        </w:rPr>
+        <w:t xml:space="preserve">What you learn: </w:t>
+      </w:r>
+      <w:r>
+        <w:t>Kafka runs as a server. Python scripts are client applications.</w:t>
+      </w:r>
+    </w:p>
+    <w:p>
+      <w:r>
+        <w:rPr>
+          <w:b/>
+        </w:rPr>
+        <w:t>Windows PowerShell</w:t>
+      </w:r>
+    </w:p>
+    <w:p>
+      <w:pPr>
+        <w:shd w:fill="F3F6FA"/>
+      </w:pPr>
+      <w:r>
+        <w:rPr>
+          <w:rFonts w:ascii="Consolas" w:hAnsi="Consolas" w:eastAsia="Consolas"/>
+          <w:sz w:val="18"/>
+        </w:rPr>
+        <w:t>cd .\Week_01\Day_02\Lab_Files</w:t>
+      </w:r>
+    </w:p>
+    <w:p>
+      <w:pPr>
+        <w:shd w:fill="F3F6FA"/>
+      </w:pPr>
+      <w:r>
+        <w:rPr>
+          <w:rFonts w:ascii="Consolas" w:hAnsi="Consolas" w:eastAsia="Consolas"/>
+          <w:sz w:val="18"/>
+        </w:rPr>
+        <w:t>docker --version</w:t>
+      </w:r>
+    </w:p>
+    <w:p>
+      <w:pPr>
+        <w:shd w:fill="F3F6FA"/>
+      </w:pPr>
+      <w:r>
+        <w:rPr>
+          <w:rFonts w:ascii="Consolas" w:hAnsi="Consolas" w:eastAsia="Consolas"/>
+          <w:sz w:val="18"/>
+        </w:rPr>
+        <w:t>docker compose version</w:t>
+      </w:r>
+    </w:p>
+    <w:p>
+      <w:pPr>
+        <w:shd w:fill="F3F6FA"/>
+      </w:pPr>
+      <w:r>
+        <w:rPr>
+          <w:rFonts w:ascii="Consolas" w:hAnsi="Consolas" w:eastAsia="Consolas"/>
+          <w:sz w:val="18"/>
+        </w:rPr>
+        <w:t>py -3 --version</w:t>
+      </w:r>
+    </w:p>
+    <w:p>
+      <w:r>
+        <w:rPr>
+          <w:b/>
+        </w:rPr>
+        <w:t>Ubuntu Bash</w:t>
+      </w:r>
+    </w:p>
+    <w:p>
+      <w:pPr>
+        <w:shd w:fill="F3F6FA"/>
+      </w:pPr>
+      <w:r>
+        <w:rPr>
+          <w:rFonts w:ascii="Consolas" w:hAnsi="Consolas" w:eastAsia="Consolas"/>
+          <w:sz w:val="18"/>
+        </w:rPr>
+        <w:t>cd Week_01/Day_02/Lab_Files</w:t>
+      </w:r>
+    </w:p>
+    <w:p>
+      <w:pPr>
+        <w:shd w:fill="F3F6FA"/>
+      </w:pPr>
+      <w:r>
+        <w:rPr>
+          <w:rFonts w:ascii="Consolas" w:hAnsi="Consolas" w:eastAsia="Consolas"/>
+          <w:sz w:val="18"/>
+        </w:rPr>
+        <w:t>docker --version</w:t>
+      </w:r>
+    </w:p>
+    <w:p>
+      <w:pPr>
+        <w:shd w:fill="F3F6FA"/>
+      </w:pPr>
+      <w:r>
+        <w:rPr>
+          <w:rFonts w:ascii="Consolas" w:hAnsi="Consolas" w:eastAsia="Consolas"/>
+          <w:sz w:val="18"/>
+        </w:rPr>
+        <w:t>docker compose version</w:t>
+      </w:r>
+    </w:p>
+    <w:p>
+      <w:pPr>
+        <w:shd w:fill="F3F6FA"/>
+      </w:pPr>
+      <w:r>
+        <w:rPr>
+          <w:rFonts w:ascii="Consolas" w:hAnsi="Consolas" w:eastAsia="Consolas"/>
+          <w:sz w:val="18"/>
+        </w:rPr>
+        <w:t>python3 --version</w:t>
+      </w:r>
+    </w:p>
+    <w:p>
+      <w:r>
+        <w:rPr>
+          <w:b/>
+        </w:rPr>
+        <w:t>Explanation:</w:t>
+      </w:r>
+    </w:p>
+    <w:p>
+      <w:pPr>
+        <w:pStyle w:val="ListBullet"/>
+      </w:pPr>
+      <w:r>
+        <w:t>Docker runs the broker and Kafka UI containers.</w:t>
+      </w:r>
+    </w:p>
+    <w:p>
+      <w:pPr>
+        <w:pStyle w:val="ListBullet"/>
+      </w:pPr>
+      <w:r>
+        <w:t>Python runs the producer and consumer on the host.</w:t>
+      </w:r>
+    </w:p>
+    <w:p>
+      <w:pPr>
+        <w:pStyle w:val="ListBullet"/>
+      </w:pPr>
+      <w:r>
+        <w:t>If Docker cannot connect on Windows, start Docker Desktop first.</w:t>
+      </w:r>
+    </w:p>
+    <w:p>
+      <w:r>
+        <w:rPr>
+          <w:b/>
+        </w:rPr>
+        <w:t xml:space="preserve">Mini-check: </w:t>
+      </w:r>
+      <w:r>
+        <w:t>Which command proves Docker Compose is installed?</w:t>
+      </w:r>
+    </w:p>
+    <w:p>
+      <w:r>
+        <w:rPr>
+          <w:b/>
+        </w:rPr>
+        <w:t xml:space="preserve">Solution: </w:t>
+      </w:r>
+      <w:r>
+        <w:t>docker compose version.</w:t>
+      </w:r>
+    </w:p>
+    <w:p>
+      <w:r>
+        <w:rPr>
+          <w:b/>
+        </w:rPr>
+        <w:t xml:space="preserve">Evidence to capture: </w:t>
+      </w:r>
+      <w:r>
+        <w:t>Docker, Compose and Python versions.</w:t>
       </w:r>
     </w:p>
     <w:p>
@@ -43,7 +233,101 @@
         <w:pStyle w:val="Heading1"/>
       </w:pPr>
       <w:r>
-        <w:t>2  Objectives</w:t>
+        <w:t>Exercise 2: Start Kafka and Kafka UI</w:t>
+      </w:r>
+    </w:p>
+    <w:p>
+      <w:r>
+        <w:rPr>
+          <w:b/>
+        </w:rPr>
+        <w:t xml:space="preserve">Goal: </w:t>
+      </w:r>
+      <w:r>
+        <w:t>Start the broker and visual UI.</w:t>
+      </w:r>
+    </w:p>
+    <w:p>
+      <w:r>
+        <w:rPr>
+          <w:b/>
+        </w:rPr>
+        <w:t xml:space="preserve">What you learn: </w:t>
+      </w:r>
+      <w:r>
+        <w:t>Kafka UI gives a browser view of topics, partitions and messages.</w:t>
+      </w:r>
+    </w:p>
+    <w:p>
+      <w:r>
+        <w:rPr>
+          <w:b/>
+        </w:rPr>
+        <w:t>Start services</w:t>
+      </w:r>
+    </w:p>
+    <w:p>
+      <w:pPr>
+        <w:shd w:fill="F3F6FA"/>
+      </w:pPr>
+      <w:r>
+        <w:rPr>
+          <w:rFonts w:ascii="Consolas" w:hAnsi="Consolas" w:eastAsia="Consolas"/>
+          <w:sz w:val="18"/>
+        </w:rPr>
+        <w:t>docker compose up -d</w:t>
+      </w:r>
+    </w:p>
+    <w:p>
+      <w:pPr>
+        <w:shd w:fill="F3F6FA"/>
+      </w:pPr>
+      <w:r>
+        <w:rPr>
+          <w:rFonts w:ascii="Consolas" w:hAnsi="Consolas" w:eastAsia="Consolas"/>
+          <w:sz w:val="18"/>
+        </w:rPr>
+        <w:t>docker ps --filter name=day2_</w:t>
+      </w:r>
+    </w:p>
+    <w:p>
+      <w:pPr>
+        <w:shd w:fill="F3F6FA"/>
+      </w:pPr>
+      <w:r>
+        <w:rPr>
+          <w:rFonts w:ascii="Consolas" w:hAnsi="Consolas" w:eastAsia="Consolas"/>
+          <w:sz w:val="18"/>
+        </w:rPr>
+        <w:t>docker logs day2_kafka --tail 40</w:t>
+      </w:r>
+    </w:p>
+    <w:p>
+      <w:r>
+        <w:rPr>
+          <w:b/>
+        </w:rPr>
+        <w:t>Open UI</w:t>
+      </w:r>
+    </w:p>
+    <w:p>
+      <w:pPr>
+        <w:shd w:fill="F3F6FA"/>
+      </w:pPr>
+      <w:r>
+        <w:rPr>
+          <w:rFonts w:ascii="Consolas" w:hAnsi="Consolas" w:eastAsia="Consolas"/>
+          <w:sz w:val="18"/>
+        </w:rPr>
+        <w:t>http://localhost:8080</w:t>
+      </w:r>
+    </w:p>
+    <w:p>
+      <w:r>
+        <w:rPr>
+          <w:b/>
+        </w:rPr>
+        <w:t>Explanation:</w:t>
       </w:r>
     </w:p>
     <w:p>
@@ -51,7 +335,7 @@
         <w:pStyle w:val="ListBullet"/>
       </w:pPr>
       <w:r>
-        <w:t>Set up a single-node Kafka cluster using Docker Compose.</w:t>
+        <w:t>day2_kafka is the broker.</w:t>
       </w:r>
     </w:p>
     <w:p>
@@ -59,7 +343,7 @@
         <w:pStyle w:val="ListBullet"/>
       </w:pPr>
       <w:r>
-        <w:t>Create and inspect Kafka topics with varying partition counts.</w:t>
+        <w:t>day2_kafka_ui is the browser UI.</w:t>
       </w:r>
     </w:p>
     <w:p>
@@ -67,7 +351,122 @@
         <w:pStyle w:val="ListBullet"/>
       </w:pPr>
       <w:r>
-        <w:t>Produce events from the CLI and a Python script using keys to influence partitioning.</w:t>
+        <w:t>Kafka UI connects internally to kafka:29092 while Python uses localhost:9092.</w:t>
+      </w:r>
+    </w:p>
+    <w:p>
+      <w:r>
+        <w:rPr>
+          <w:b/>
+        </w:rPr>
+        <w:t xml:space="preserve">Mini-check: </w:t>
+      </w:r>
+      <w:r>
+        <w:t>Which container serves the browser UI?</w:t>
+      </w:r>
+    </w:p>
+    <w:p>
+      <w:r>
+        <w:rPr>
+          <w:b/>
+        </w:rPr>
+        <w:t xml:space="preserve">Solution: </w:t>
+      </w:r>
+      <w:r>
+        <w:t>day2_kafka_ui.</w:t>
+      </w:r>
+    </w:p>
+    <w:p>
+      <w:r>
+        <w:rPr>
+          <w:b/>
+        </w:rPr>
+        <w:t xml:space="preserve">Evidence to capture: </w:t>
+      </w:r>
+      <w:r>
+        <w:t>Both containers running and Kafka UI opens.</w:t>
+      </w:r>
+    </w:p>
+    <w:p>
+      <w:pPr>
+        <w:pStyle w:val="Heading1"/>
+      </w:pPr>
+      <w:r>
+        <w:t>Exercise 3: Read the Compose Architecture</w:t>
+      </w:r>
+    </w:p>
+    <w:p>
+      <w:r>
+        <w:rPr>
+          <w:b/>
+        </w:rPr>
+        <w:t xml:space="preserve">Goal: </w:t>
+      </w:r>
+      <w:r>
+        <w:t>Understand listeners before creating topics.</w:t>
+      </w:r>
+    </w:p>
+    <w:p>
+      <w:r>
+        <w:rPr>
+          <w:b/>
+        </w:rPr>
+        <w:t xml:space="preserve">What you learn: </w:t>
+      </w:r>
+      <w:r>
+        <w:t>Dual listeners let containers and host clients connect correctly.</w:t>
+      </w:r>
+    </w:p>
+    <w:p>
+      <w:r>
+        <w:rPr>
+          <w:b/>
+        </w:rPr>
+        <w:t>Open compose file</w:t>
+      </w:r>
+    </w:p>
+    <w:p>
+      <w:pPr>
+        <w:shd w:fill="F3F6FA"/>
+      </w:pPr>
+      <w:r>
+        <w:rPr>
+          <w:rFonts w:ascii="Consolas" w:hAnsi="Consolas" w:eastAsia="Consolas"/>
+          <w:sz w:val="18"/>
+        </w:rPr>
+        <w:t>type docker-compose.yml</w:t>
+      </w:r>
+    </w:p>
+    <w:p>
+      <w:pPr>
+        <w:shd w:fill="F3F6FA"/>
+      </w:pPr>
+      <w:r>
+        <w:rPr>
+          <w:rFonts w:ascii="Consolas" w:hAnsi="Consolas" w:eastAsia="Consolas"/>
+          <w:sz w:val="18"/>
+        </w:rPr>
+        <w:t># Ubuntu:</w:t>
+      </w:r>
+    </w:p>
+    <w:p>
+      <w:pPr>
+        <w:shd w:fill="F3F6FA"/>
+      </w:pPr>
+      <w:r>
+        <w:rPr>
+          <w:rFonts w:ascii="Consolas" w:hAnsi="Consolas" w:eastAsia="Consolas"/>
+          <w:sz w:val="18"/>
+        </w:rPr>
+        <w:t>cat docker-compose.yml</w:t>
+      </w:r>
+    </w:p>
+    <w:p>
+      <w:r>
+        <w:rPr>
+          <w:b/>
+        </w:rPr>
+        <w:t>Explanation:</w:t>
       </w:r>
     </w:p>
     <w:p>
@@ -75,7 +474,7 @@
         <w:pStyle w:val="ListBullet"/>
       </w:pPr>
       <w:r>
-        <w:t>Consume events from the CLI and Python, and explore consumer groups and offsets.</w:t>
+        <w:t>PLAINTEXT://kafka:29092 is for Docker-internal clients.</w:t>
       </w:r>
     </w:p>
     <w:p>
@@ -83,7 +482,7 @@
         <w:pStyle w:val="ListBullet"/>
       </w:pPr>
       <w:r>
-        <w:t>Understand why message serialization matters and the role of schema registries.</w:t>
+        <w:t>PLAINTEXT_HOST://localhost:9092 is for host Python and CLI clients.</w:t>
       </w:r>
     </w:p>
     <w:p>
@@ -91,7 +490,40 @@
         <w:pStyle w:val="ListBullet"/>
       </w:pPr>
       <w:r>
-        <w:t>Brainstorm real-time use cases and partitioning strategies.</w:t>
+        <w:t>KAFKA_PROCESS_ROLES includes broker and controller for the KRaft lab.</w:t>
+      </w:r>
+    </w:p>
+    <w:p>
+      <w:r>
+        <w:rPr>
+          <w:b/>
+        </w:rPr>
+        <w:t xml:space="preserve">Mini-check: </w:t>
+      </w:r>
+      <w:r>
+        <w:t>Why does Kafka UI use kafka:29092 instead of localhost:9092?</w:t>
+      </w:r>
+    </w:p>
+    <w:p>
+      <w:r>
+        <w:rPr>
+          <w:b/>
+        </w:rPr>
+        <w:t xml:space="preserve">Solution: </w:t>
+      </w:r>
+      <w:r>
+        <w:t>Because Kafka UI runs inside Docker; localhost would point to the UI container itself.</w:t>
+      </w:r>
+    </w:p>
+    <w:p>
+      <w:r>
+        <w:rPr>
+          <w:b/>
+        </w:rPr>
+        <w:t xml:space="preserve">Evidence to capture: </w:t>
+      </w:r>
+      <w:r>
+        <w:t>Short note explaining the two listeners.</w:t>
       </w:r>
     </w:p>
     <w:p>
@@ -99,82 +531,126 @@
         <w:pStyle w:val="Heading1"/>
       </w:pPr>
       <w:r>
-        <w:t>3  Environment Setup</w:t>
+        <w:t>Exercise 4: Create the order-events Topic</w:t>
       </w:r>
     </w:p>
     <w:p>
       <w:r>
-        <w:t>If you have not already completed the Day 1 installation, run the appropriate script from the install-scripts directory. On Ubuntu, execute ./install_linux.sh from a terminal with sudo privileges. On Windows, run the PowerShell script install_windows.ps1 from an elevated prompt. These scripts install Docker, Python and Git, and configure your user for Docker access.</w:t>
+        <w:rPr>
+          <w:b/>
+        </w:rPr>
+        <w:t xml:space="preserve">Goal: </w:t>
+      </w:r>
+      <w:r>
+        <w:t>Create a named stream with three partitions.</w:t>
       </w:r>
     </w:p>
     <w:p>
       <w:r>
-        <w:t>After installation, clone the lab repository and navigate to the day2_final/lab-code directory in your terminal. Start the single-node Kafka cluster using Docker Compose:</w:t>
+        <w:rPr>
+          <w:b/>
+        </w:rPr>
+        <w:t xml:space="preserve">What you learn: </w:t>
+      </w:r>
+      <w:r>
+        <w:t>A topic is the event stream; partitions are ordered lanes.</w:t>
+      </w:r>
+    </w:p>
+    <w:p>
+      <w:r>
+        <w:rPr>
+          <w:b/>
+        </w:rPr>
+        <w:t>Create and describe</w:t>
       </w:r>
     </w:p>
     <w:p>
       <w:pPr>
-        <w:pStyle w:val="BodyText"/>
+        <w:shd w:fill="F3F6FA"/>
       </w:pPr>
       <w:r>
-        <w:t>cd day2_final/lab-code</w:t>
+        <w:rPr>
+          <w:rFonts w:ascii="Consolas" w:hAnsi="Consolas" w:eastAsia="Consolas"/>
+          <w:sz w:val="18"/>
+        </w:rPr>
+        <w:t>docker exec day2_kafka kafka-topics --bootstrap-server localhost:9092 --create --if-not-exists --topic order-events --partitions 3 --replication-factor 1</w:t>
       </w:r>
     </w:p>
     <w:p>
       <w:pPr>
-        <w:pStyle w:val="BodyText"/>
+        <w:shd w:fill="F3F6FA"/>
       </w:pPr>
+      <w:r>
+        <w:rPr>
+          <w:rFonts w:ascii="Consolas" w:hAnsi="Consolas" w:eastAsia="Consolas"/>
+          <w:sz w:val="18"/>
+        </w:rPr>
+        <w:t>docker exec day2_kafka kafka-topics --bootstrap-server localhost:9092 --describe --topic order-events</w:t>
+      </w:r>
     </w:p>
     <w:p>
-      <w:pPr>
-        <w:pStyle w:val="BodyText"/>
-      </w:pPr>
       <w:r>
-        <w:t># Start the Kafka broker (in KRaft mode)</w:t>
+        <w:rPr>
+          <w:b/>
+        </w:rPr>
+        <w:t>Explanation:</w:t>
       </w:r>
     </w:p>
     <w:p>
       <w:pPr>
-        <w:pStyle w:val="BodyText"/>
+        <w:pStyle w:val="ListBullet"/>
       </w:pPr>
       <w:r>
-        <w:t>docker compose up -d</w:t>
+        <w:t>--topic names the stream.</w:t>
+      </w:r>
+    </w:p>
+    <w:p>
+      <w:pPr>
+        <w:pStyle w:val="ListBullet"/>
+      </w:pPr>
+      <w:r>
+        <w:t>--partitions 3 creates three lanes.</w:t>
+      </w:r>
+    </w:p>
+    <w:p>
+      <w:pPr>
+        <w:pStyle w:val="ListBullet"/>
+      </w:pPr>
+      <w:r>
+        <w:t>--replication-factor 1 is suitable only for this single-broker lab.</w:t>
       </w:r>
     </w:p>
     <w:p>
       <w:r>
-        <w:t>Correction for the supplied KRaft Compose file: the Kafka service must include a CLUSTER_ID environment value, for example CLUSTER_ID: 'MkU3OEVBNTcwNTJENDM2Qk'.</w:t>
+        <w:rPr>
+          <w:b/>
+        </w:rPr>
+        <w:t xml:space="preserve">Mini-check: </w:t>
       </w:r>
-    </w:p>
-    <w:p>
-      <w:pPr>
-        <w:pStyle w:val="BodyText"/>
-      </w:pPr>
-    </w:p>
-    <w:p>
       <w:r>
-        <w:t>If you run Docker through sudo and the mounted ./data folder becomes root-owned, make it writable for the Kafka container before starting: sudo mkdir -p data &amp;&amp; sudo chown -R 1000:1000 data</w:t>
-      </w:r>
-    </w:p>
-    <w:p>
-      <w:pPr>
-        <w:pStyle w:val="BodyText"/>
-      </w:pPr>
-      <w:r>
-        <w:t># Check that the broker is running:</w:t>
-      </w:r>
-    </w:p>
-    <w:p>
-      <w:pPr>
-        <w:pStyle w:val="BodyText"/>
-      </w:pPr>
-      <w:r>
-        <w:t>docker ps</w:t>
+        <w:t>Where should order-events appear in Kafka UI?</w:t>
       </w:r>
     </w:p>
     <w:p>
       <w:r>
-        <w:t>The Kafka broker exposes ports 9092 (client) and 9093 (controller). Wait a few seconds for the cluster to become ready before creating topics.</w:t>
+        <w:rPr>
+          <w:b/>
+        </w:rPr>
+        <w:t xml:space="preserve">Solution: </w:t>
+      </w:r>
+      <w:r>
+        <w:t>Kafka UI -&gt; Topics -&gt; order-events.</w:t>
+      </w:r>
+    </w:p>
+    <w:p>
+      <w:r>
+        <w:rPr>
+          <w:b/>
+        </w:rPr>
+        <w:t xml:space="preserve">Evidence to capture: </w:t>
+      </w:r>
+      <w:r>
+        <w:t>Topic description and Kafka UI topic visible.</w:t>
       </w:r>
     </w:p>
     <w:p>
@@ -182,63 +658,170 @@
         <w:pStyle w:val="Heading1"/>
       </w:pPr>
       <w:r>
-        <w:t>4  Creating Topics</w:t>
+        <w:t>Exercise 5: Prove the Event Bus with Console Tools</w:t>
       </w:r>
     </w:p>
     <w:p>
       <w:r>
-        <w:t>Kafka topics are logical channels where events are published and consumed. Each topic is divided into partitions which provide scalability and parallelism. To create a topic named demo-topic with 3 partitions and a replication factor of 1, run the following command inside the Kafka container:</w:t>
+        <w:rPr>
+          <w:b/>
+        </w:rPr>
+        <w:t xml:space="preserve">Goal: </w:t>
+      </w:r>
+      <w:r>
+        <w:t>Produce JSON and consume it back.</w:t>
       </w:r>
     </w:p>
     <w:p>
       <w:r>
-        <w:t># Use the Kafka topic command inside the container. In the supplied Confluent image, the commands do not use the .sh suffix.</w:t>
+        <w:rPr>
+          <w:b/>
+        </w:rPr>
+        <w:t xml:space="preserve">What you learn: </w:t>
+      </w:r>
+      <w:r>
+        <w:t>Kafka decouples sender and reader.</w:t>
+      </w:r>
+    </w:p>
+    <w:p>
+      <w:r>
+        <w:rPr>
+          <w:b/>
+        </w:rPr>
+        <w:t>Produce records</w:t>
       </w:r>
     </w:p>
     <w:p>
       <w:pPr>
-        <w:pStyle w:val="BodyText"/>
+        <w:shd w:fill="F3F6FA"/>
       </w:pPr>
       <w:r>
-        <w:t># Replace &lt;container_id&gt; with the ID of your Kafka container (e.g., day2_kafka)</w:t>
+        <w:rPr>
+          <w:rFonts w:ascii="Consolas" w:hAnsi="Consolas" w:eastAsia="Consolas"/>
+          <w:sz w:val="18"/>
+        </w:rPr>
+        <w:t>docker exec -i day2_kafka kafka-console-producer --bootstrap-server localhost:9092 --topic order-events</w:t>
       </w:r>
     </w:p>
     <w:p>
       <w:pPr>
-        <w:pStyle w:val="BodyText"/>
+        <w:shd w:fill="F3F6FA"/>
       </w:pPr>
-    </w:p>
-    <w:p>
       <w:r>
-        <w:t>docker exec -it &lt;container_id&gt; kafka-topics --create --topic demo-topic --partitions 3 --replication-factor 1 --bootstrap-server localhost:9092</w:t>
+        <w:rPr>
+          <w:rFonts w:ascii="Consolas" w:hAnsi="Consolas" w:eastAsia="Consolas"/>
+          <w:sz w:val="18"/>
+        </w:rPr>
+        <w:t>{"event_type":"OrderStatusChanged","order_id":"ORD-1","status":"PAID"}</w:t>
       </w:r>
     </w:p>
     <w:p>
       <w:pPr>
-        <w:pStyle w:val="BodyText"/>
-      </w:pPr>
-    </w:p>
-    <w:p>
-      <w:pPr>
-        <w:pStyle w:val="BodyText"/>
+        <w:shd w:fill="F3F6FA"/>
       </w:pPr>
       <w:r>
-        <w:t># Verify the topic configuration</w:t>
+        <w:rPr>
+          <w:rFonts w:ascii="Consolas" w:hAnsi="Consolas" w:eastAsia="Consolas"/>
+          <w:sz w:val="18"/>
+        </w:rPr>
+        <w:t>{"event_type":"OrderStatusChanged","order_id":"ORD-2","status":"PACKED"}</w:t>
       </w:r>
     </w:p>
     <w:p>
       <w:pPr>
-        <w:pStyle w:val="BodyText"/>
+        <w:shd w:fill="F3F6FA"/>
       </w:pPr>
-    </w:p>
-    <w:p>
       <w:r>
-        <w:t>docker exec -it &lt;container_id&gt; kafka-topics --describe --topic demo-topic --bootstrap-server localhost:9092</w:t>
+        <w:rPr>
+          <w:rFonts w:ascii="Consolas" w:hAnsi="Consolas" w:eastAsia="Consolas"/>
+          <w:sz w:val="18"/>
+        </w:rPr>
+        <w:t># Press Ctrl+C</w:t>
       </w:r>
     </w:p>
     <w:p>
       <w:r>
-        <w:t>Observe the output to see the partition IDs and leader assignments. The replication factor of 1 means there is only one copy of each partition in this single-node cluster.</w:t>
+        <w:rPr>
+          <w:b/>
+        </w:rPr>
+        <w:t>Consume records</w:t>
+      </w:r>
+    </w:p>
+    <w:p>
+      <w:pPr>
+        <w:shd w:fill="F3F6FA"/>
+      </w:pPr>
+      <w:r>
+        <w:rPr>
+          <w:rFonts w:ascii="Consolas" w:hAnsi="Consolas" w:eastAsia="Consolas"/>
+          <w:sz w:val="18"/>
+        </w:rPr>
+        <w:t>docker exec day2_kafka kafka-console-consumer --bootstrap-server localhost:9092 --topic order-events --from-beginning --max-messages 2</w:t>
+      </w:r>
+    </w:p>
+    <w:p>
+      <w:r>
+        <w:rPr>
+          <w:b/>
+        </w:rPr>
+        <w:t>Explanation:</w:t>
+      </w:r>
+    </w:p>
+    <w:p>
+      <w:pPr>
+        <w:pStyle w:val="ListBullet"/>
+      </w:pPr>
+      <w:r>
+        <w:t>The producer writes records.</w:t>
+      </w:r>
+    </w:p>
+    <w:p>
+      <w:pPr>
+        <w:pStyle w:val="ListBullet"/>
+      </w:pPr>
+      <w:r>
+        <w:t>The consumer reads retained records.</w:t>
+      </w:r>
+    </w:p>
+    <w:p>
+      <w:pPr>
+        <w:pStyle w:val="ListBullet"/>
+      </w:pPr>
+      <w:r>
+        <w:t>Kafka UI can show the same messages in the topic view.</w:t>
+      </w:r>
+    </w:p>
+    <w:p>
+      <w:r>
+        <w:rPr>
+          <w:b/>
+        </w:rPr>
+        <w:t xml:space="preserve">Mini-check: </w:t>
+      </w:r>
+      <w:r>
+        <w:t>What does --from-beginning do?</w:t>
+      </w:r>
+    </w:p>
+    <w:p>
+      <w:r>
+        <w:rPr>
+          <w:b/>
+        </w:rPr>
+        <w:t xml:space="preserve">Solution: </w:t>
+      </w:r>
+      <w:r>
+        <w:t>It reads retained records from the start for this consumer run.</w:t>
+      </w:r>
+    </w:p>
+    <w:p>
+      <w:r>
+        <w:rPr>
+          <w:b/>
+        </w:rPr>
+        <w:t xml:space="preserve">Evidence to capture: </w:t>
+      </w:r>
+      <w:r>
+        <w:t>Two JSON records in terminal and Kafka UI.</w:t>
       </w:r>
     </w:p>
     <w:p>
@@ -246,67 +829,182 @@
         <w:pStyle w:val="Heading1"/>
       </w:pPr>
       <w:r>
-        <w:t>5  Producing Events with the Console</w:t>
+        <w:t>Exercise 6: Create the Python Environment</w:t>
       </w:r>
     </w:p>
     <w:p>
       <w:r>
-        <w:t>Kafka provides a built-in console producer tool that reads lines from stdin and writes them to a topic. Use the following command to produce messages to demo-topic:</w:t>
+        <w:rPr>
+          <w:b/>
+        </w:rPr>
+        <w:t xml:space="preserve">Goal: </w:t>
+      </w:r>
+      <w:r>
+        <w:t>Install kafka-python locally.</w:t>
+      </w:r>
+    </w:p>
+    <w:p>
+      <w:r>
+        <w:rPr>
+          <w:b/>
+        </w:rPr>
+        <w:t xml:space="preserve">What you learn: </w:t>
+      </w:r>
+      <w:r>
+        <w:t>The scripts are real application clients.</w:t>
+      </w:r>
+    </w:p>
+    <w:p>
+      <w:r>
+        <w:rPr>
+          <w:b/>
+        </w:rPr>
+        <w:t>Windows PowerShell</w:t>
       </w:r>
     </w:p>
     <w:p>
       <w:pPr>
-        <w:pStyle w:val="BodyText"/>
+        <w:shd w:fill="F3F6FA"/>
       </w:pPr>
       <w:r>
-        <w:t># Start a console producer and enter messages manually. Press Ctrl-D to exit.</w:t>
+        <w:rPr>
+          <w:rFonts w:ascii="Consolas" w:hAnsi="Consolas" w:eastAsia="Consolas"/>
+          <w:sz w:val="18"/>
+        </w:rPr>
+        <w:t>py -3 -m venv .venv</w:t>
+      </w:r>
+    </w:p>
+    <w:p>
+      <w:pPr>
+        <w:shd w:fill="F3F6FA"/>
+      </w:pPr>
+      <w:r>
+        <w:rPr>
+          <w:rFonts w:ascii="Consolas" w:hAnsi="Consolas" w:eastAsia="Consolas"/>
+          <w:sz w:val="18"/>
+        </w:rPr>
+        <w:t>.\.venv\Scripts\Activate.ps1</w:t>
+      </w:r>
+    </w:p>
+    <w:p>
+      <w:pPr>
+        <w:shd w:fill="F3F6FA"/>
+      </w:pPr>
+      <w:r>
+        <w:rPr>
+          <w:rFonts w:ascii="Consolas" w:hAnsi="Consolas" w:eastAsia="Consolas"/>
+          <w:sz w:val="18"/>
+        </w:rPr>
+        <w:t>python -m pip install kafka-python</w:t>
       </w:r>
     </w:p>
     <w:p>
       <w:r>
-        <w:t>docker exec -it &lt;container_id&gt; kafka-console-producer --topic demo-topic --bootstrap-server localhost:9092 --property parse.key=true --property key.separator=:</w:t>
+        <w:rPr>
+          <w:b/>
+        </w:rPr>
+        <w:t>Ubuntu Bash</w:t>
       </w:r>
     </w:p>
     <w:p>
       <w:pPr>
-        <w:pStyle w:val="BodyText"/>
-      </w:pPr>
-    </w:p>
-    <w:p>
-      <w:pPr>
-        <w:pStyle w:val="BodyText"/>
+        <w:shd w:fill="F3F6FA"/>
       </w:pPr>
       <w:r>
-        <w:t># Example messages to type or paste:</w:t>
+        <w:rPr>
+          <w:rFonts w:ascii="Consolas" w:hAnsi="Consolas" w:eastAsia="Consolas"/>
+          <w:sz w:val="18"/>
+        </w:rPr>
+        <w:t>python3 -m venv .venv</w:t>
       </w:r>
     </w:p>
     <w:p>
       <w:pPr>
-        <w:pStyle w:val="BodyText"/>
+        <w:shd w:fill="F3F6FA"/>
       </w:pPr>
       <w:r>
-        <w:t>key1:Hello world</w:t>
+        <w:rPr>
+          <w:rFonts w:ascii="Consolas" w:hAnsi="Consolas" w:eastAsia="Consolas"/>
+          <w:sz w:val="18"/>
+        </w:rPr>
+        <w:t>source .venv/bin/activate</w:t>
       </w:r>
     </w:p>
     <w:p>
       <w:pPr>
-        <w:pStyle w:val="BodyText"/>
+        <w:shd w:fill="F3F6FA"/>
       </w:pPr>
       <w:r>
-        <w:t>key2:Another event</w:t>
+        <w:rPr>
+          <w:rFonts w:ascii="Consolas" w:hAnsi="Consolas" w:eastAsia="Consolas"/>
+          <w:sz w:val="18"/>
+        </w:rPr>
+        <w:t>python -m pip install kafka-python</w:t>
+      </w:r>
+    </w:p>
+    <w:p>
+      <w:r>
+        <w:rPr>
+          <w:b/>
+        </w:rPr>
+        <w:t>Explanation:</w:t>
       </w:r>
     </w:p>
     <w:p>
       <w:pPr>
-        <w:pStyle w:val="BodyText"/>
+        <w:pStyle w:val="ListBullet"/>
       </w:pPr>
       <w:r>
-        <w:t>key1:A second event on the same key</w:t>
+        <w:t>A virtual environment isolates dependencies.</w:t>
+      </w:r>
+    </w:p>
+    <w:p>
+      <w:pPr>
+        <w:pStyle w:val="ListBullet"/>
+      </w:pPr>
+      <w:r>
+        <w:t>kafka-python provides KafkaProducer and KafkaConsumer.</w:t>
+      </w:r>
+    </w:p>
+    <w:p>
+      <w:pPr>
+        <w:pStyle w:val="ListBullet"/>
+      </w:pPr>
+      <w:r>
+        <w:t>Python connects to localhost:9092.</w:t>
       </w:r>
     </w:p>
     <w:p>
       <w:r>
-        <w:t>The parse.key=true and key.separator=: properties instruct the producer to split each line into a key and value using the colon delimiter. Events with the same key will be routed to the same partition, allowing you to control ordering.</w:t>
+        <w:rPr>
+          <w:b/>
+        </w:rPr>
+        <w:t xml:space="preserve">Mini-check: </w:t>
+      </w:r>
+      <w:r>
+        <w:t>Which Python package gives us KafkaProducer?</w:t>
+      </w:r>
+    </w:p>
+    <w:p>
+      <w:r>
+        <w:rPr>
+          <w:b/>
+        </w:rPr>
+        <w:t xml:space="preserve">Solution: </w:t>
+      </w:r>
+      <w:r>
+        <w:t>kafka-python.</w:t>
+      </w:r>
+    </w:p>
+    <w:p>
+      <w:r>
+        <w:rPr>
+          <w:b/>
+        </w:rPr>
+        <w:t xml:space="preserve">Evidence to capture: </w:t>
+      </w:r>
+      <w:r>
+        <w:t>Package installation completes.</w:t>
       </w:r>
     </w:p>
     <w:p>
@@ -314,66 +1012,138 @@
         <w:pStyle w:val="Heading1"/>
       </w:pPr>
       <w:r>
-        <w:t>6  Consuming Events with the Console</w:t>
+        <w:t>Exercise 7: Understand producer.py</w:t>
       </w:r>
     </w:p>
     <w:p>
       <w:r>
-        <w:t>To read events from a topic, use the console consumer. By default, it starts at the latest offset. To read from the beginning, add --from-beginning. You can also specify a consumer group to coordinate multiple consumers.</w:t>
+        <w:rPr>
+          <w:b/>
+        </w:rPr>
+        <w:t xml:space="preserve">Goal: </w:t>
+      </w:r>
+      <w:r>
+        <w:t>Read producer configuration and event construction.</w:t>
+      </w:r>
+    </w:p>
+    <w:p>
+      <w:r>
+        <w:rPr>
+          <w:b/>
+        </w:rPr>
+        <w:t xml:space="preserve">What you learn: </w:t>
+      </w:r>
+      <w:r>
+        <w:t>Producer flags control connection, serialization, batching and reliability.</w:t>
+      </w:r>
+    </w:p>
+    <w:p>
+      <w:r>
+        <w:rPr>
+          <w:b/>
+        </w:rPr>
+        <w:t>Open producer</w:t>
       </w:r>
     </w:p>
     <w:p>
       <w:pPr>
-        <w:pStyle w:val="BodyText"/>
+        <w:shd w:fill="F3F6FA"/>
       </w:pPr>
       <w:r>
-        <w:t># Read from the beginning of the demo-topic as part of group "group1":</w:t>
+        <w:rPr>
+          <w:rFonts w:ascii="Consolas" w:hAnsi="Consolas" w:eastAsia="Consolas"/>
+          <w:sz w:val="18"/>
+        </w:rPr>
+        <w:t>notepad producer.py</w:t>
+      </w:r>
+    </w:p>
+    <w:p>
+      <w:pPr>
+        <w:shd w:fill="F3F6FA"/>
+      </w:pPr>
+      <w:r>
+        <w:rPr>
+          <w:rFonts w:ascii="Consolas" w:hAnsi="Consolas" w:eastAsia="Consolas"/>
+          <w:sz w:val="18"/>
+        </w:rPr>
+        <w:t># Or:</w:t>
+      </w:r>
+    </w:p>
+    <w:p>
+      <w:pPr>
+        <w:shd w:fill="F3F6FA"/>
+      </w:pPr>
+      <w:r>
+        <w:rPr>
+          <w:rFonts w:ascii="Consolas" w:hAnsi="Consolas" w:eastAsia="Consolas"/>
+          <w:sz w:val="18"/>
+        </w:rPr>
+        <w:t>code producer.py</w:t>
       </w:r>
     </w:p>
     <w:p>
       <w:r>
-        <w:t>docker exec -it &lt;container_id&gt; kafka-console-consumer --topic demo-topic --from-beginning --bootstrap-server localhost:9092 --group group1</w:t>
+        <w:rPr>
+          <w:b/>
+        </w:rPr>
+        <w:t>Explanation:</w:t>
       </w:r>
     </w:p>
     <w:p>
       <w:pPr>
-        <w:pStyle w:val="BodyText"/>
+        <w:pStyle w:val="ListBullet"/>
       </w:pPr>
+      <w:r>
+        <w:t>build_order_event creates a meaningful payload.</w:t>
+      </w:r>
     </w:p>
     <w:p>
       <w:pPr>
-        <w:pStyle w:val="BodyText"/>
+        <w:pStyle w:val="ListBullet"/>
       </w:pPr>
       <w:r>
-        <w:t># Start a second consumer with the same group to see partition rebalancing:</w:t>
+        <w:t>key_serializer and value_serializer convert objects to bytes.</w:t>
+      </w:r>
+    </w:p>
+    <w:p>
+      <w:pPr>
+        <w:pStyle w:val="ListBullet"/>
+      </w:pPr>
+      <w:r>
+        <w:t>acks, retries, linger_ms, batch_size and compression_type are producer behavior flags.</w:t>
       </w:r>
     </w:p>
     <w:p>
       <w:r>
-        <w:t>docker exec -it &lt;container_id&gt; kafka-console-consumer --topic demo-topic --from-beginning --bootstrap-server localhost:9092 --group group1</w:t>
+        <w:rPr>
+          <w:b/>
+        </w:rPr>
+        <w:t xml:space="preserve">Mini-check: </w:t>
       </w:r>
-    </w:p>
-    <w:p>
-      <w:pPr>
-        <w:pStyle w:val="BodyText"/>
-      </w:pPr>
-    </w:p>
-    <w:p>
-      <w:pPr>
-        <w:pStyle w:val="BodyText"/>
-      </w:pPr>
       <w:r>
-        <w:t># Start a consumer in a different group (reads all messages independently):</w:t>
+        <w:t>Which field should be used as key for order lifecycle events?</w:t>
       </w:r>
     </w:p>
     <w:p>
       <w:r>
-        <w:t>docker exec -it &lt;container_id&gt; kafka-console-consumer --topic demo-topic --from-beginning --bootstrap-server localhost:9092 --group group2</w:t>
+        <w:rPr>
+          <w:b/>
+        </w:rPr>
+        <w:t xml:space="preserve">Solution: </w:t>
+      </w:r>
+      <w:r>
+        <w:t>order_id, because updates for one order should stay ordered.</w:t>
       </w:r>
     </w:p>
     <w:p>
       <w:r>
-        <w:t>Observe how partitions are assigned to consumers when multiple members of the same group are running. Each partition is consumed by exactly one member within a group. Groups maintain offsets so that consumers can resume processing from their last committed position.</w:t>
+        <w:rPr>
+          <w:b/>
+        </w:rPr>
+        <w:t xml:space="preserve">Evidence to capture: </w:t>
+      </w:r>
+      <w:r>
+        <w:t>Notes for key, value, serializers and producer flags.</w:t>
       </w:r>
     </w:p>
     <w:p>
@@ -381,54 +1151,114 @@
         <w:pStyle w:val="Heading1"/>
       </w:pPr>
       <w:r>
-        <w:t>7  Producing and Consuming with Python</w:t>
+        <w:t>Exercise 8: Run producer.py</w:t>
       </w:r>
     </w:p>
     <w:p>
       <w:r>
-        <w:t>For application development, you typically interact with Kafka via client libraries. The lab repository provides simple Python scripts in the lab-code directory. First, install the dependency using pip:</w:t>
+        <w:rPr>
+          <w:b/>
+        </w:rPr>
+        <w:t xml:space="preserve">Goal: </w:t>
+      </w:r>
+      <w:r>
+        <w:t>Publish order events and inspect delivery metadata.</w:t>
       </w:r>
     </w:p>
     <w:p>
       <w:r>
-        <w:t>python3 -m pip install --user kafka-python</w:t>
+        <w:rPr>
+          <w:b/>
+        </w:rPr>
+        <w:t xml:space="preserve">What you learn: </w:t>
+      </w:r>
+      <w:r>
+        <w:t>Kafka returns topic, partition and offset after storing records.</w:t>
+      </w:r>
+    </w:p>
+    <w:p>
+      <w:r>
+        <w:rPr>
+          <w:b/>
+        </w:rPr>
+        <w:t>Run producer</w:t>
       </w:r>
     </w:p>
     <w:p>
       <w:pPr>
-        <w:pStyle w:val="BodyText"/>
+        <w:shd w:fill="F3F6FA"/>
       </w:pPr>
       <w:r>
-        <w:t>Then, open two terminal windows. In the first, run the producer script to emit ten JSON messages with a fixed key:</w:t>
+        <w:rPr>
+          <w:rFonts w:ascii="Consolas" w:hAnsi="Consolas" w:eastAsia="Consolas"/>
+          <w:sz w:val="18"/>
+        </w:rPr>
+        <w:t>python producer.py</w:t>
+      </w:r>
+    </w:p>
+    <w:p>
+      <w:r>
+        <w:rPr>
+          <w:b/>
+        </w:rPr>
+        <w:t>Explanation:</w:t>
       </w:r>
     </w:p>
     <w:p>
       <w:pPr>
-        <w:pStyle w:val="BodyText"/>
+        <w:pStyle w:val="ListBullet"/>
       </w:pPr>
       <w:r>
-        <w:t>python producer.py</w:t>
+        <w:t>partition tells the lane.</w:t>
       </w:r>
     </w:p>
     <w:p>
       <w:pPr>
-        <w:pStyle w:val="BodyText"/>
+        <w:pStyle w:val="ListBullet"/>
       </w:pPr>
       <w:r>
-        <w:t>In the second terminal, run the consumer script to subscribe to the topic and print each received event:</w:t>
+        <w:t>offset tells the position in that lane.</w:t>
       </w:r>
     </w:p>
     <w:p>
       <w:pPr>
-        <w:pStyle w:val="BodyText"/>
+        <w:pStyle w:val="ListBullet"/>
       </w:pPr>
       <w:r>
-        <w:t>python consumer.py</w:t>
+        <w:t>Kafka UI should show new messages in order-events.</w:t>
       </w:r>
     </w:p>
     <w:p>
       <w:r>
-        <w:t>Try modifying producer.py to vary the message key based on the loop index (e.g., key = f"key-{i % 3}"). Watch how the consumer prints the partition number; messages with the same key should map to the same partition.</w:t>
+        <w:rPr>
+          <w:b/>
+        </w:rPr>
+        <w:t xml:space="preserve">Mini-check: </w:t>
+      </w:r>
+      <w:r>
+        <w:t>What is an offset?</w:t>
+      </w:r>
+    </w:p>
+    <w:p>
+      <w:r>
+        <w:rPr>
+          <w:b/>
+        </w:rPr>
+        <w:t xml:space="preserve">Solution: </w:t>
+      </w:r>
+      <w:r>
+        <w:t>A record position inside one partition log.</w:t>
+      </w:r>
+    </w:p>
+    <w:p>
+      <w:r>
+        <w:rPr>
+          <w:b/>
+        </w:rPr>
+        <w:t xml:space="preserve">Evidence to capture: </w:t>
+      </w:r>
+      <w:r>
+        <w:t>Producer output and Kafka UI messages.</w:t>
       </w:r>
     </w:p>
     <w:p>
@@ -436,36 +1266,114 @@
         <w:pStyle w:val="Heading1"/>
       </w:pPr>
       <w:r>
-        <w:t>8  Partitioning Experiment</w:t>
+        <w:t>Exercise 9: Understand and Run consumer.py</w:t>
       </w:r>
     </w:p>
     <w:p>
       <w:r>
-        <w:t>Partitioning is critical for scalability and ordering guarantees【525385649920661†L157-L184】. Create another topic with a different number of partitions (e.g., 5) and repeat the CLI and Python experiments. Questions to consider:</w:t>
+        <w:rPr>
+          <w:b/>
+        </w:rPr>
+        <w:t xml:space="preserve">Goal: </w:t>
+      </w:r>
+      <w:r>
+        <w:t>Read events as a separate application.</w:t>
+      </w:r>
+    </w:p>
+    <w:p>
+      <w:r>
+        <w:rPr>
+          <w:b/>
+        </w:rPr>
+        <w:t xml:space="preserve">What you learn: </w:t>
+      </w:r>
+      <w:r>
+        <w:t>Consumers deserialize bytes and process business events.</w:t>
+      </w:r>
+    </w:p>
+    <w:p>
+      <w:r>
+        <w:rPr>
+          <w:b/>
+        </w:rPr>
+        <w:t>Run consumer</w:t>
       </w:r>
     </w:p>
     <w:p>
       <w:pPr>
-        <w:pStyle w:val="ListNumber"/>
+        <w:shd w:fill="F3F6FA"/>
       </w:pPr>
       <w:r>
-        <w:t>How does increasing the partition count affect throughput and parallelism?</w:t>
+        <w:rPr>
+          <w:rFonts w:ascii="Consolas" w:hAnsi="Consolas" w:eastAsia="Consolas"/>
+          <w:sz w:val="18"/>
+        </w:rPr>
+        <w:t>python consumer.py</w:t>
+      </w:r>
+    </w:p>
+    <w:p>
+      <w:r>
+        <w:rPr>
+          <w:b/>
+        </w:rPr>
+        <w:t>Explanation:</w:t>
       </w:r>
     </w:p>
     <w:p>
       <w:pPr>
-        <w:pStyle w:val="ListNumber"/>
+        <w:pStyle w:val="ListBullet"/>
       </w:pPr>
       <w:r>
-        <w:t>What happens if you add or remove consumers within the same group?</w:t>
+        <w:t>message.value is business data.</w:t>
       </w:r>
     </w:p>
     <w:p>
       <w:pPr>
-        <w:pStyle w:val="ListNumber"/>
+        <w:pStyle w:val="ListBullet"/>
       </w:pPr>
       <w:r>
-        <w:t>How do keyed messages ensure ordering within a partition?</w:t>
+        <w:t>message.key is the business/routing key.</w:t>
+      </w:r>
+    </w:p>
+    <w:p>
+      <w:pPr>
+        <w:pStyle w:val="ListBullet"/>
+      </w:pPr>
+      <w:r>
+        <w:t>topic, partition and offset are Kafka metadata.</w:t>
+      </w:r>
+    </w:p>
+    <w:p>
+      <w:r>
+        <w:rPr>
+          <w:b/>
+        </w:rPr>
+        <w:t xml:space="preserve">Mini-check: </w:t>
+      </w:r>
+      <w:r>
+        <w:t>Why is the consumer independent from checkout-service?</w:t>
+      </w:r>
+    </w:p>
+    <w:p>
+      <w:r>
+        <w:rPr>
+          <w:b/>
+        </w:rPr>
+        <w:t xml:space="preserve">Solution: </w:t>
+      </w:r>
+      <w:r>
+        <w:t>It reads the event from Kafka instead of calling checkout-service directly.</w:t>
+      </w:r>
+    </w:p>
+    <w:p>
+      <w:r>
+        <w:rPr>
+          <w:b/>
+        </w:rPr>
+        <w:t xml:space="preserve">Evidence to capture: </w:t>
+      </w:r>
+      <w:r>
+        <w:t>Consumer output with key, partition and offset.</w:t>
       </w:r>
     </w:p>
     <w:p>
@@ -473,204 +1381,150 @@
         <w:pStyle w:val="Heading1"/>
       </w:pPr>
       <w:r>
-        <w:t>9  Serialization and Schema Management</w:t>
+        <w:t>Exercise 10: Change Keys and Observe Partitions</w:t>
       </w:r>
     </w:p>
     <w:p>
       <w:r>
-        <w:t>In production systems, messages are often encoded in compact binary formats like Avro, Protobuf or JSON Schema. These formats allow data to be serialized with associated schemas, enabling schema evolution while maintaining compatibility【645518690862239†L139-L173】. For this lab, we focus on conceptual understanding. If time permits, install the fastavro package and experiment with serializing your Python objects to Avro. A typical Avro message includes a schema ID which references a schema stored in a schema registry. When using Avro, both producers and consumers consult the registry to ensure they agree on the schema【645518690862239†L284-L296】.</w:t>
+        <w:rPr>
+          <w:b/>
+        </w:rPr>
+        <w:t xml:space="preserve">Goal: </w:t>
+      </w:r>
+      <w:r>
+        <w:t>Modify events and observe key-based placement.</w:t>
+      </w:r>
+    </w:p>
+    <w:p>
+      <w:r>
+        <w:rPr>
+          <w:b/>
+        </w:rPr>
+        <w:t xml:space="preserve">What you learn: </w:t>
+      </w:r>
+      <w:r>
+        <w:t>Keys connect business identity to Kafka partitioning.</w:t>
+      </w:r>
+    </w:p>
+    <w:p>
+      <w:r>
+        <w:rPr>
+          <w:b/>
+        </w:rPr>
+        <w:t>Edit and rerun</w:t>
       </w:r>
     </w:p>
     <w:p>
       <w:pPr>
-        <w:pStyle w:val="Heading1"/>
+        <w:shd w:fill="F3F6FA"/>
       </w:pPr>
       <w:r>
-        <w:t>10  Brainstorming: Real‑Time Use Cases</w:t>
+        <w:rPr>
+          <w:rFonts w:ascii="Consolas" w:hAnsi="Consolas" w:eastAsia="Consolas"/>
+          <w:sz w:val="18"/>
+        </w:rPr>
+        <w:t>notepad producer.py</w:t>
+      </w:r>
+    </w:p>
+    <w:p>
+      <w:pPr>
+        <w:shd w:fill="F3F6FA"/>
+      </w:pPr>
+      <w:r>
+        <w:rPr>
+          <w:rFonts w:ascii="Consolas" w:hAnsi="Consolas" w:eastAsia="Consolas"/>
+          <w:sz w:val="18"/>
+        </w:rPr>
+        <w:t># Add a new ORD-1004 event or more ORD-1001 events</w:t>
+      </w:r>
+    </w:p>
+    <w:p>
+      <w:pPr>
+        <w:shd w:fill="F3F6FA"/>
+      </w:pPr>
+      <w:r>
+        <w:rPr>
+          <w:rFonts w:ascii="Consolas" w:hAnsi="Consolas" w:eastAsia="Consolas"/>
+          <w:sz w:val="18"/>
+        </w:rPr>
+        <w:t>python producer.py</w:t>
+      </w:r>
+    </w:p>
+    <w:p>
+      <w:pPr>
+        <w:shd w:fill="F3F6FA"/>
+      </w:pPr>
+      <w:r>
+        <w:rPr>
+          <w:rFonts w:ascii="Consolas" w:hAnsi="Consolas" w:eastAsia="Consolas"/>
+          <w:sz w:val="18"/>
+        </w:rPr>
+        <w:t>python consumer.py</w:t>
       </w:r>
     </w:p>
     <w:p>
       <w:r>
-        <w:t>Break into small groups and discuss real‑time streaming scenarios relevant to your organisation. Examples include fraud detection on e‑commerce transactions, monitoring IoT sensor data, personalised recommendations, or log aggregation【519392226886461†L115-L124】. Sketch a simple architecture for your chosen use case: identify producers, topics, partitions, consumers and any necessary transformations. Share your ideas with the class.</w:t>
+        <w:rPr>
+          <w:b/>
+        </w:rPr>
+        <w:t>Explanation:</w:t>
       </w:r>
     </w:p>
     <w:p>
       <w:pPr>
-        <w:pStyle w:val="Heading1"/>
+        <w:pStyle w:val="ListBullet"/>
       </w:pPr>
       <w:r>
-        <w:t>11  Mini Quiz</w:t>
+        <w:t>Same order_id values should map to the same partition.</w:t>
+      </w:r>
+    </w:p>
+    <w:p>
+      <w:pPr>
+        <w:pStyle w:val="ListBullet"/>
+      </w:pPr>
+      <w:r>
+        <w:t>Different keys can distribute across lanes.</w:t>
+      </w:r>
+    </w:p>
+    <w:p>
+      <w:pPr>
+        <w:pStyle w:val="ListBullet"/>
+      </w:pPr>
+      <w:r>
+        <w:t>Ordering is within one partition, not globally across all partitions.</w:t>
       </w:r>
     </w:p>
     <w:p>
       <w:r>
-        <w:t>Answer the following questions to check your understanding. Write your answers on a separate sheet or discuss with a partner.</w:t>
+        <w:rPr>
+          <w:b/>
+        </w:rPr>
+        <w:t xml:space="preserve">Mini-check: </w:t>
       </w:r>
-    </w:p>
-    <w:p>
-      <w:pPr>
-        <w:pStyle w:val="ListNumber"/>
-      </w:pPr>
       <w:r>
-        <w:t>Q1. What is the difference between a topic and a partition in Kafka?</w:t>
-      </w:r>
-    </w:p>
-    <w:p>
-      <w:pPr>
-        <w:pStyle w:val="ListBullet2"/>
-      </w:pPr>
-      <w:r>
-        <w:t>A. Topics are the high‑level channels; partitions are the unit of parallelism within a topic.</w:t>
-      </w:r>
-    </w:p>
-    <w:p>
-      <w:pPr>
-        <w:pStyle w:val="ListBullet2"/>
-      </w:pPr>
-      <w:r>
-        <w:t>B. Partitions come before topics in the pipeline.</w:t>
-      </w:r>
-    </w:p>
-    <w:p>
-      <w:pPr>
-        <w:pStyle w:val="ListBullet2"/>
-      </w:pPr>
-      <w:r>
-        <w:t>C. Topics store offsets whereas partitions store metadata.</w:t>
-      </w:r>
-    </w:p>
-    <w:p>
-      <w:pPr>
-        <w:pStyle w:val="ListNumber"/>
-      </w:pPr>
-      <w:r>
-        <w:t>Q2. Which acks setting provides at‑least‑once delivery for producers?</w:t>
-      </w:r>
-    </w:p>
-    <w:p>
-      <w:pPr>
-        <w:pStyle w:val="ListBullet2"/>
-      </w:pPr>
-      <w:r>
-        <w:t>A. acks=0</w:t>
-      </w:r>
-    </w:p>
-    <w:p>
-      <w:pPr>
-        <w:pStyle w:val="ListBullet2"/>
-      </w:pPr>
-      <w:r>
-        <w:t>B. acks=1</w:t>
-      </w:r>
-    </w:p>
-    <w:p>
-      <w:pPr>
-        <w:pStyle w:val="ListBullet2"/>
-      </w:pPr>
-      <w:r>
-        <w:t>C. acks=all</w:t>
-      </w:r>
-    </w:p>
-    <w:p>
-      <w:pPr>
-        <w:pStyle w:val="ListNumber"/>
-      </w:pPr>
-      <w:r>
-        <w:t>Q3. What happens when two consumers with the same group ID subscribe to the same topic with three partitions?</w:t>
-      </w:r>
-    </w:p>
-    <w:p>
-      <w:pPr>
-        <w:pStyle w:val="ListBullet2"/>
-      </w:pPr>
-      <w:r>
-        <w:t>A. Both consumers read every partition independently.</w:t>
-      </w:r>
-    </w:p>
-    <w:p>
-      <w:pPr>
-        <w:pStyle w:val="ListBullet2"/>
-      </w:pPr>
-      <w:r>
-        <w:t>B. Each consumer reads a subset of partitions; together they cover all partitions.</w:t>
-      </w:r>
-    </w:p>
-    <w:p>
-      <w:pPr>
-        <w:pStyle w:val="ListBullet2"/>
-      </w:pPr>
-      <w:r>
-        <w:t>C. Only one consumer will receive messages and the other stays idle.</w:t>
-      </w:r>
-    </w:p>
-    <w:p>
-      <w:pPr>
-        <w:pStyle w:val="ListNumber"/>
-      </w:pPr>
-      <w:r>
-        <w:t>Q4. Why might you choose Avro over JSON for message encoding?</w:t>
-      </w:r>
-    </w:p>
-    <w:p>
-      <w:pPr>
-        <w:pStyle w:val="ListBullet2"/>
-      </w:pPr>
-      <w:r>
-        <w:t>A. Avro supports schema evolution and binary encoding for efficiency【645518690862239†L139-L173】.</w:t>
-      </w:r>
-    </w:p>
-    <w:p>
-      <w:pPr>
-        <w:pStyle w:val="ListBullet2"/>
-      </w:pPr>
-      <w:r>
-        <w:t>B. JSON is faster to parse and more compact than Avro.</w:t>
-      </w:r>
-    </w:p>
-    <w:p>
-      <w:pPr>
-        <w:pStyle w:val="ListBullet2"/>
-      </w:pPr>
-      <w:r>
-        <w:t>C. Avro messages are human‑readable by default.</w:t>
-      </w:r>
-    </w:p>
-    <w:p>
-      <w:pPr>
-        <w:pStyle w:val="Heading1"/>
-      </w:pPr>
-      <w:r>
-        <w:t>12  Quiz Answers</w:t>
+        <w:t>What is the risk of using the same constant key for every record?</w:t>
       </w:r>
     </w:p>
     <w:p>
       <w:r>
-        <w:t>Flip to this section only after attempting the quiz questions on your own. Answers:</w:t>
-        <w:br/>
-        <w:br/>
-        <w:t>1. A – Topics are logical categories; partitions are the unit of parallelism which provide ordering within a partition【672673436079528†L171-L182】.</w:t>
-        <w:br/>
-        <w:t>2. B – acks=1 waits for the leader broker to confirm the write, giving at‑least‑once semantics【154439817660870†L174-L194】.</w:t>
-        <w:br/>
-        <w:t>3. B – Kafka distributes partitions among consumers in the same group. With two consumers and three partitions, one will get two partitions and the other one partition【467896230016399†L346-L356】.</w:t>
-        <w:br/>
-        <w:t>4. A – Avro uses binary encoding and embeds schema information, supporting schema evolution and compact messages【645518690862239†L139-L173】.</w:t>
+        <w:rPr>
+          <w:b/>
+        </w:rPr>
+        <w:t xml:space="preserve">Solution: </w:t>
       </w:r>
-    </w:p>
-    <w:p>
-      <w:pPr>
-        <w:pStyle w:val="Heading1"/>
-      </w:pPr>
       <w:r>
-        <w:t>13  Recap and Next Steps</w:t>
+        <w:t>All records go to one lane, reducing parallelism.</w:t>
       </w:r>
     </w:p>
     <w:p>
       <w:r>
-        <w:t>In this lab you set up a Kafka cluster, created topics, produced and consumed events from both the command line and Python, experimented with partitioning and consumer groups, and learned about serialization formats. Partitioning enables horizontal scalability and ordering guarantees【525385649920661†L157-L184】, while consumer groups allow for load balancing and fault tolerance. Producers control delivery guarantees via the acks setting【154439817660870†L174-L194】, and serialization frameworks like Avro support efficient encoding and schema evolution【645518690862239†L139-L173】.</w:t>
-        <w:br/>
-        <w:br/>
-        <w:t>Next, continue exploring streaming use cases by building a simple microservice that filters or enriches data, and experiment with connectors like Kafka Connect to integrate databases.</w:t>
+        <w:rPr>
+          <w:b/>
+        </w:rPr>
+        <w:t xml:space="preserve">Evidence to capture: </w:t>
+      </w:r>
+      <w:r>
+        <w:t>Small table: order_id, partition and offset.</w:t>
       </w:r>
     </w:p>
     <w:sectPr>
@@ -1046,6 +1900,10 @@
     <w:name w:val="Normal"/>
     <w:qFormat/>
     <w:rsid w:val="00FC693F"/>
+    <w:rPr>
+      <w:rFonts w:ascii="Calibri" w:hAnsi="Calibri"/>
+      <w:sz w:val="20"/>
+    </w:rPr>
   </w:style>
   <w:style w:type="paragraph" w:styleId="Header">
     <w:name w:val="header"/>
@@ -12728,12 +13586,6 @@
         <w:shd w:val="clear" w:color="auto" w:fill="FBCAA2" w:themeFill="accent6" w:themeFillTint="7F"/>
       </w:tcPr>
     </w:tblStylePr>
-  </w:style>
-  <w:style w:type="paragraph" w:customStyle="1" w:styleId="BodyText">
-    <w:name w:val="BodyText"/>
-    <w:rPr>
-      <w:sz w:val="22"/>
-    </w:rPr>
   </w:style>
 </w:styles>
 </file>

</xml_diff>